<commit_message>
Add CDR3 length analysis and update results document
New section 2.4 with 6 CDR3 figures analyzing average CDR3 length
across disease, sex, age, and clone tiers. Updated Word document
now contains 28 embedded figures total.

https://claude.ai/code/session_01D55fsgxxDUfDTuPfRhF34U
</commit_message>
<xml_diff>
--- a/immunedb_STATS_API/Immune_Repertoire_Analysis_Results.docx
+++ b/immunedb_STATS_API/Immune_Repertoire_Analysis_Results.docx
@@ -178,6 +178,14 @@
       </w:pPr>
       <w:r>
         <w:t xml:space="preserve">   2.3 Top X Clone Fraction (Repertoire Dominance)</w:t>
+      </w:r>
+    </w:p>
+    <w:p>
+      <w:pPr>
+        <w:spacing w:after="40" w:before="40"/>
+      </w:pPr>
+      <w:r>
+        <w:t xml:space="preserve">   2.4 CDR3 Length (Amino Acid)</w:t>
       </w:r>
     </w:p>
     <w:p>
@@ -3799,6 +3807,861 @@
     </w:p>
     <w:p>
       <w:pPr>
+        <w:pStyle w:val="Heading2"/>
+      </w:pPr>
+      <w:r>
+        <w:rPr>
+          <w:color w:val="1A3C6E"/>
+        </w:rPr>
+        <w:t>2.4 CDR3 Length (Amino Acid)</w:t>
+      </w:r>
+    </w:p>
+    <w:p>
+      <w:pPr>
+        <w:spacing w:after="120"/>
+      </w:pPr>
+      <w:r>
+        <w:t>CDR3 (Complementarity-Determining Region 3) length is a key structural feature of antibodies that determines antigen-binding specificity. Longer CDR3 regions can access recessed epitopes and are often associated with broadly neutralizing antibodies. Here we analyze the average CDR3 length (in amino acids) of the top 10, 100, and 1,000 most expanded clones per repertoire.</w:t>
+      </w:r>
+    </w:p>
+    <w:p>
+      <w:pPr>
+        <w:pStyle w:val="Heading3"/>
+      </w:pPr>
+      <w:r>
+        <w:rPr>
+          <w:color w:val="1A3C6E"/>
+        </w:rPr>
+        <w:t>2.4.1 CDR3 Length by Disease Category</w:t>
+      </w:r>
+    </w:p>
+    <w:tbl>
+      <w:tblPr>
+        <w:tblStyle w:val="LightShading-Accent1"/>
+        <w:tblW w:type="auto" w:w="0"/>
+        <w:jc w:val="center"/>
+        <w:tblLook w:firstColumn="1" w:firstRow="1" w:lastColumn="0" w:lastRow="0" w:noHBand="0" w:noVBand="1" w:val="04A0"/>
+      </w:tblPr>
+      <w:tblGrid>
+        <w:gridCol w:w="1728"/>
+        <w:gridCol w:w="1728"/>
+        <w:gridCol w:w="1728"/>
+        <w:gridCol w:w="1728"/>
+        <w:gridCol w:w="1728"/>
+      </w:tblGrid>
+      <w:tr>
+        <w:tc>
+          <w:tcPr>
+            <w:tcW w:type="dxa" w:w="1728"/>
+          </w:tcPr>
+          <w:p>
+            <w:r>
+              <w:rPr>
+                <w:b/>
+                <w:sz w:val="20"/>
+              </w:rPr>
+              <w:t>Disease Category</w:t>
+            </w:r>
+          </w:p>
+        </w:tc>
+        <w:tc>
+          <w:tcPr>
+            <w:tcW w:type="dxa" w:w="1728"/>
+          </w:tcPr>
+          <w:p>
+            <w:r>
+              <w:rPr>
+                <w:b/>
+                <w:sz w:val="20"/>
+              </w:rPr>
+              <w:t>N</w:t>
+            </w:r>
+          </w:p>
+        </w:tc>
+        <w:tc>
+          <w:tcPr>
+            <w:tcW w:type="dxa" w:w="1728"/>
+          </w:tcPr>
+          <w:p>
+            <w:r>
+              <w:rPr>
+                <w:b/>
+                <w:sz w:val="20"/>
+              </w:rPr>
+              <w:t>Top 10 (median)</w:t>
+            </w:r>
+          </w:p>
+        </w:tc>
+        <w:tc>
+          <w:tcPr>
+            <w:tcW w:type="dxa" w:w="1728"/>
+          </w:tcPr>
+          <w:p>
+            <w:r>
+              <w:rPr>
+                <w:b/>
+                <w:sz w:val="20"/>
+              </w:rPr>
+              <w:t>Top 100 (median)</w:t>
+            </w:r>
+          </w:p>
+        </w:tc>
+        <w:tc>
+          <w:tcPr>
+            <w:tcW w:type="dxa" w:w="1728"/>
+          </w:tcPr>
+          <w:p>
+            <w:r>
+              <w:rPr>
+                <w:b/>
+                <w:sz w:val="20"/>
+              </w:rPr>
+              <w:t>Top 1000 (median)</w:t>
+            </w:r>
+          </w:p>
+        </w:tc>
+      </w:tr>
+      <w:tr>
+        <w:tc>
+          <w:tcPr>
+            <w:tcW w:type="dxa" w:w="1728"/>
+          </w:tcPr>
+          <w:p>
+            <w:r>
+              <w:rPr>
+                <w:sz w:val="20"/>
+              </w:rPr>
+              <w:t>COVID Naive</w:t>
+            </w:r>
+          </w:p>
+        </w:tc>
+        <w:tc>
+          <w:tcPr>
+            <w:tcW w:type="dxa" w:w="1728"/>
+          </w:tcPr>
+          <w:p>
+            <w:r>
+              <w:rPr>
+                <w:sz w:val="20"/>
+              </w:rPr>
+              <w:t>8</w:t>
+            </w:r>
+          </w:p>
+        </w:tc>
+        <w:tc>
+          <w:tcPr>
+            <w:tcW w:type="dxa" w:w="1728"/>
+          </w:tcPr>
+          <w:p>
+            <w:r>
+              <w:rPr>
+                <w:sz w:val="20"/>
+              </w:rPr>
+              <w:t>15.0 AA</w:t>
+            </w:r>
+          </w:p>
+        </w:tc>
+        <w:tc>
+          <w:tcPr>
+            <w:tcW w:type="dxa" w:w="1728"/>
+          </w:tcPr>
+          <w:p>
+            <w:r>
+              <w:rPr>
+                <w:sz w:val="20"/>
+              </w:rPr>
+              <w:t>16.8 AA</w:t>
+            </w:r>
+          </w:p>
+        </w:tc>
+        <w:tc>
+          <w:tcPr>
+            <w:tcW w:type="dxa" w:w="1728"/>
+          </w:tcPr>
+          <w:p>
+            <w:r>
+              <w:rPr>
+                <w:sz w:val="20"/>
+              </w:rPr>
+              <w:t>17.4 AA</w:t>
+            </w:r>
+          </w:p>
+        </w:tc>
+      </w:tr>
+      <w:tr>
+        <w:tc>
+          <w:tcPr>
+            <w:tcW w:type="dxa" w:w="1728"/>
+          </w:tcPr>
+          <w:p>
+            <w:r>
+              <w:rPr>
+                <w:sz w:val="20"/>
+              </w:rPr>
+              <w:t>Mild</w:t>
+            </w:r>
+          </w:p>
+        </w:tc>
+        <w:tc>
+          <w:tcPr>
+            <w:tcW w:type="dxa" w:w="1728"/>
+          </w:tcPr>
+          <w:p>
+            <w:r>
+              <w:rPr>
+                <w:sz w:val="20"/>
+              </w:rPr>
+              <w:t>38</w:t>
+            </w:r>
+          </w:p>
+        </w:tc>
+        <w:tc>
+          <w:tcPr>
+            <w:tcW w:type="dxa" w:w="1728"/>
+          </w:tcPr>
+          <w:p>
+            <w:r>
+              <w:rPr>
+                <w:sz w:val="20"/>
+              </w:rPr>
+              <w:t>16.5 AA</w:t>
+            </w:r>
+          </w:p>
+        </w:tc>
+        <w:tc>
+          <w:tcPr>
+            <w:tcW w:type="dxa" w:w="1728"/>
+          </w:tcPr>
+          <w:p>
+            <w:r>
+              <w:rPr>
+                <w:sz w:val="20"/>
+              </w:rPr>
+              <w:t>16.9 AA</w:t>
+            </w:r>
+          </w:p>
+        </w:tc>
+        <w:tc>
+          <w:tcPr>
+            <w:tcW w:type="dxa" w:w="1728"/>
+          </w:tcPr>
+          <w:p>
+            <w:r>
+              <w:rPr>
+                <w:sz w:val="20"/>
+              </w:rPr>
+              <w:t>17.0 AA</w:t>
+            </w:r>
+          </w:p>
+        </w:tc>
+      </w:tr>
+      <w:tr>
+        <w:tc>
+          <w:tcPr>
+            <w:tcW w:type="dxa" w:w="1728"/>
+          </w:tcPr>
+          <w:p>
+            <w:r>
+              <w:rPr>
+                <w:sz w:val="20"/>
+              </w:rPr>
+              <w:t>Moderate</w:t>
+            </w:r>
+          </w:p>
+        </w:tc>
+        <w:tc>
+          <w:tcPr>
+            <w:tcW w:type="dxa" w:w="1728"/>
+          </w:tcPr>
+          <w:p>
+            <w:r>
+              <w:rPr>
+                <w:sz w:val="20"/>
+              </w:rPr>
+              <w:t>9</w:t>
+            </w:r>
+          </w:p>
+        </w:tc>
+        <w:tc>
+          <w:tcPr>
+            <w:tcW w:type="dxa" w:w="1728"/>
+          </w:tcPr>
+          <w:p>
+            <w:r>
+              <w:rPr>
+                <w:sz w:val="20"/>
+              </w:rPr>
+              <w:t>17.3 AA</w:t>
+            </w:r>
+          </w:p>
+        </w:tc>
+        <w:tc>
+          <w:tcPr>
+            <w:tcW w:type="dxa" w:w="1728"/>
+          </w:tcPr>
+          <w:p>
+            <w:r>
+              <w:rPr>
+                <w:sz w:val="20"/>
+              </w:rPr>
+              <w:t>17.2 AA</w:t>
+            </w:r>
+          </w:p>
+        </w:tc>
+        <w:tc>
+          <w:tcPr>
+            <w:tcW w:type="dxa" w:w="1728"/>
+          </w:tcPr>
+          <w:p>
+            <w:r>
+              <w:rPr>
+                <w:sz w:val="20"/>
+              </w:rPr>
+              <w:t>17.5 AA</w:t>
+            </w:r>
+          </w:p>
+        </w:tc>
+      </w:tr>
+      <w:tr>
+        <w:tc>
+          <w:tcPr>
+            <w:tcW w:type="dxa" w:w="1728"/>
+          </w:tcPr>
+          <w:p>
+            <w:r>
+              <w:rPr>
+                <w:sz w:val="20"/>
+              </w:rPr>
+              <w:t>Recovered</w:t>
+            </w:r>
+          </w:p>
+        </w:tc>
+        <w:tc>
+          <w:tcPr>
+            <w:tcW w:type="dxa" w:w="1728"/>
+          </w:tcPr>
+          <w:p>
+            <w:r>
+              <w:rPr>
+                <w:sz w:val="20"/>
+              </w:rPr>
+              <w:t>12</w:t>
+            </w:r>
+          </w:p>
+        </w:tc>
+        <w:tc>
+          <w:tcPr>
+            <w:tcW w:type="dxa" w:w="1728"/>
+          </w:tcPr>
+          <w:p>
+            <w:r>
+              <w:rPr>
+                <w:sz w:val="20"/>
+              </w:rPr>
+              <w:t>15.8 AA</w:t>
+            </w:r>
+          </w:p>
+        </w:tc>
+        <w:tc>
+          <w:tcPr>
+            <w:tcW w:type="dxa" w:w="1728"/>
+          </w:tcPr>
+          <w:p>
+            <w:r>
+              <w:rPr>
+                <w:sz w:val="20"/>
+              </w:rPr>
+              <w:t>17.2 AA</w:t>
+            </w:r>
+          </w:p>
+        </w:tc>
+        <w:tc>
+          <w:tcPr>
+            <w:tcW w:type="dxa" w:w="1728"/>
+          </w:tcPr>
+          <w:p>
+            <w:r>
+              <w:rPr>
+                <w:sz w:val="20"/>
+              </w:rPr>
+              <w:t>17.5 AA</w:t>
+            </w:r>
+          </w:p>
+        </w:tc>
+      </w:tr>
+      <w:tr>
+        <w:tc>
+          <w:tcPr>
+            <w:tcW w:type="dxa" w:w="1728"/>
+          </w:tcPr>
+          <w:p>
+            <w:r>
+              <w:rPr>
+                <w:sz w:val="20"/>
+              </w:rPr>
+              <w:t>Severe</w:t>
+            </w:r>
+          </w:p>
+        </w:tc>
+        <w:tc>
+          <w:tcPr>
+            <w:tcW w:type="dxa" w:w="1728"/>
+          </w:tcPr>
+          <w:p>
+            <w:r>
+              <w:rPr>
+                <w:sz w:val="20"/>
+              </w:rPr>
+              <w:t>18</w:t>
+            </w:r>
+          </w:p>
+        </w:tc>
+        <w:tc>
+          <w:tcPr>
+            <w:tcW w:type="dxa" w:w="1728"/>
+          </w:tcPr>
+          <w:p>
+            <w:r>
+              <w:rPr>
+                <w:sz w:val="20"/>
+              </w:rPr>
+              <w:t>17.6 AA</w:t>
+            </w:r>
+          </w:p>
+        </w:tc>
+        <w:tc>
+          <w:tcPr>
+            <w:tcW w:type="dxa" w:w="1728"/>
+          </w:tcPr>
+          <w:p>
+            <w:r>
+              <w:rPr>
+                <w:sz w:val="20"/>
+              </w:rPr>
+              <w:t>17.4 AA</w:t>
+            </w:r>
+          </w:p>
+        </w:tc>
+        <w:tc>
+          <w:tcPr>
+            <w:tcW w:type="dxa" w:w="1728"/>
+          </w:tcPr>
+          <w:p>
+            <w:r>
+              <w:rPr>
+                <w:sz w:val="20"/>
+              </w:rPr>
+              <w:t>17.2 AA</w:t>
+            </w:r>
+          </w:p>
+        </w:tc>
+      </w:tr>
+    </w:tbl>
+    <w:p/>
+    <w:p>
+      <w:pPr>
+        <w:spacing w:after="120"/>
+      </w:pPr>
+      <w:r>
+        <w:rPr>
+          <w:b/>
+        </w:rPr>
+        <w:t xml:space="preserve">Key finding: </w:t>
+      </w:r>
+      <w:r>
+        <w:t>Severe cases show the longest CDR3 in their top 10 clones (median 17.6 AA), while COVID Naive show the shortest (median 15.0 AA). However, CDR3 lengths converge across disease categories when considering the top 1000 clones (~17.0-17.5 AA), suggesting that the CDR3 length differences are primarily driven by the most dominant clones.</w:t>
+      </w:r>
+    </w:p>
+    <w:p>
+      <w:pPr>
+        <w:jc w:val="center"/>
+      </w:pPr>
+      <w:r>
+        <w:drawing>
+          <wp:inline xmlns:a="http://schemas.openxmlformats.org/drawingml/2006/main" xmlns:pic="http://schemas.openxmlformats.org/drawingml/2006/picture">
+            <wp:extent cx="5486400" cy="2351314"/>
+            <wp:docPr id="25" name="Picture 25"/>
+            <wp:cNvGraphicFramePr>
+              <a:graphicFrameLocks noChangeAspect="1"/>
+            </wp:cNvGraphicFramePr>
+            <a:graphic>
+              <a:graphicData uri="http://schemas.openxmlformats.org/drawingml/2006/picture">
+                <pic:pic>
+                  <pic:nvPicPr>
+                    <pic:cNvPr id="0" name="cdr3_by_disease.png"/>
+                    <pic:cNvPicPr/>
+                  </pic:nvPicPr>
+                  <pic:blipFill>
+                    <a:blip r:embed="rId33"/>
+                    <a:stretch>
+                      <a:fillRect/>
+                    </a:stretch>
+                  </pic:blipFill>
+                  <pic:spPr>
+                    <a:xfrm>
+                      <a:off x="0" y="0"/>
+                      <a:ext cx="5486400" cy="2351314"/>
+                    </a:xfrm>
+                    <a:prstGeom prst="rect"/>
+                  </pic:spPr>
+                </pic:pic>
+              </a:graphicData>
+            </a:graphic>
+          </wp:inline>
+        </w:drawing>
+      </w:r>
+    </w:p>
+    <w:p>
+      <w:pPr>
+        <w:jc w:val="center"/>
+      </w:pPr>
+      <w:r>
+        <w:rPr>
+          <w:i/>
+          <w:color w:val="555555"/>
+          <w:sz w:val="18"/>
+        </w:rPr>
+        <w:t>Figure 2.4.1. Average CDR3 length (AA) by disease category (faceted by clone tier).</w:t>
+      </w:r>
+    </w:p>
+    <w:p>
+      <w:pPr>
+        <w:pStyle w:val="Heading3"/>
+      </w:pPr>
+      <w:r>
+        <w:rPr>
+          <w:color w:val="1A3C6E"/>
+        </w:rPr>
+        <w:t>2.4.2 CDR3 Length by Sex</w:t>
+      </w:r>
+    </w:p>
+    <w:p>
+      <w:pPr>
+        <w:spacing w:after="120"/>
+      </w:pPr>
+      <w:r>
+        <w:t>CDR3 lengths are comparable between males (median 17.0 AA) and females (median 17.1 AA) for the top 10 clones, with no meaningful sex-based differences observed.</w:t>
+      </w:r>
+    </w:p>
+    <w:p>
+      <w:pPr>
+        <w:jc w:val="center"/>
+      </w:pPr>
+      <w:r>
+        <w:drawing>
+          <wp:inline xmlns:a="http://schemas.openxmlformats.org/drawingml/2006/main" xmlns:pic="http://schemas.openxmlformats.org/drawingml/2006/picture">
+            <wp:extent cx="5029200" cy="2514600"/>
+            <wp:docPr id="26" name="Picture 26"/>
+            <wp:cNvGraphicFramePr>
+              <a:graphicFrameLocks noChangeAspect="1"/>
+            </wp:cNvGraphicFramePr>
+            <a:graphic>
+              <a:graphicData uri="http://schemas.openxmlformats.org/drawingml/2006/picture">
+                <pic:pic>
+                  <pic:nvPicPr>
+                    <pic:cNvPr id="0" name="cdr3_by_sex.png"/>
+                    <pic:cNvPicPr/>
+                  </pic:nvPicPr>
+                  <pic:blipFill>
+                    <a:blip r:embed="rId34"/>
+                    <a:stretch>
+                      <a:fillRect/>
+                    </a:stretch>
+                  </pic:blipFill>
+                  <pic:spPr>
+                    <a:xfrm>
+                      <a:off x="0" y="0"/>
+                      <a:ext cx="5029200" cy="2514600"/>
+                    </a:xfrm>
+                    <a:prstGeom prst="rect"/>
+                  </pic:spPr>
+                </pic:pic>
+              </a:graphicData>
+            </a:graphic>
+          </wp:inline>
+        </w:drawing>
+      </w:r>
+    </w:p>
+    <w:p>
+      <w:pPr>
+        <w:jc w:val="center"/>
+      </w:pPr>
+      <w:r>
+        <w:rPr>
+          <w:i/>
+          <w:color w:val="555555"/>
+          <w:sz w:val="18"/>
+        </w:rPr>
+        <w:t>Figure 2.4.2. Average CDR3 length (AA) by sex.</w:t>
+      </w:r>
+    </w:p>
+    <w:p>
+      <w:pPr>
+        <w:pStyle w:val="Heading3"/>
+      </w:pPr>
+      <w:r>
+        <w:rPr>
+          <w:color w:val="1A3C6E"/>
+        </w:rPr>
+        <w:t>2.4.3 CDR3 Length by Age Group</w:t>
+      </w:r>
+    </w:p>
+    <w:p>
+      <w:pPr>
+        <w:jc w:val="center"/>
+      </w:pPr>
+      <w:r>
+        <w:drawing>
+          <wp:inline xmlns:a="http://schemas.openxmlformats.org/drawingml/2006/main" xmlns:pic="http://schemas.openxmlformats.org/drawingml/2006/picture">
+            <wp:extent cx="5029200" cy="2514600"/>
+            <wp:docPr id="27" name="Picture 27"/>
+            <wp:cNvGraphicFramePr>
+              <a:graphicFrameLocks noChangeAspect="1"/>
+            </wp:cNvGraphicFramePr>
+            <a:graphic>
+              <a:graphicData uri="http://schemas.openxmlformats.org/drawingml/2006/picture">
+                <pic:pic>
+                  <pic:nvPicPr>
+                    <pic:cNvPr id="0" name="cdr3_by_age.png"/>
+                    <pic:cNvPicPr/>
+                  </pic:nvPicPr>
+                  <pic:blipFill>
+                    <a:blip r:embed="rId35"/>
+                    <a:stretch>
+                      <a:fillRect/>
+                    </a:stretch>
+                  </pic:blipFill>
+                  <pic:spPr>
+                    <a:xfrm>
+                      <a:off x="0" y="0"/>
+                      <a:ext cx="5029200" cy="2514600"/>
+                    </a:xfrm>
+                    <a:prstGeom prst="rect"/>
+                  </pic:spPr>
+                </pic:pic>
+              </a:graphicData>
+            </a:graphic>
+          </wp:inline>
+        </w:drawing>
+      </w:r>
+    </w:p>
+    <w:p>
+      <w:pPr>
+        <w:jc w:val="center"/>
+      </w:pPr>
+      <w:r>
+        <w:rPr>
+          <w:i/>
+          <w:color w:val="555555"/>
+          <w:sz w:val="18"/>
+        </w:rPr>
+        <w:t>Figure 2.4.3. Average CDR3 length (AA) by age group.</w:t>
+      </w:r>
+    </w:p>
+    <w:p>
+      <w:pPr>
+        <w:pStyle w:val="Heading3"/>
+      </w:pPr>
+      <w:r>
+        <w:rPr>
+          <w:color w:val="1A3C6E"/>
+        </w:rPr>
+        <w:t>2.4.4 CDR3 Length (Top 10) by Disease x Sex</w:t>
+      </w:r>
+    </w:p>
+    <w:p>
+      <w:pPr>
+        <w:jc w:val="center"/>
+      </w:pPr>
+      <w:r>
+        <w:drawing>
+          <wp:inline xmlns:a="http://schemas.openxmlformats.org/drawingml/2006/main" xmlns:pic="http://schemas.openxmlformats.org/drawingml/2006/picture">
+            <wp:extent cx="5029200" cy="2514600"/>
+            <wp:docPr id="28" name="Picture 28"/>
+            <wp:cNvGraphicFramePr>
+              <a:graphicFrameLocks noChangeAspect="1"/>
+            </wp:cNvGraphicFramePr>
+            <a:graphic>
+              <a:graphicData uri="http://schemas.openxmlformats.org/drawingml/2006/picture">
+                <pic:pic>
+                  <pic:nvPicPr>
+                    <pic:cNvPr id="0" name="cdr3_top10_by_disease_sex.png"/>
+                    <pic:cNvPicPr/>
+                  </pic:nvPicPr>
+                  <pic:blipFill>
+                    <a:blip r:embed="rId36"/>
+                    <a:stretch>
+                      <a:fillRect/>
+                    </a:stretch>
+                  </pic:blipFill>
+                  <pic:spPr>
+                    <a:xfrm>
+                      <a:off x="0" y="0"/>
+                      <a:ext cx="5029200" cy="2514600"/>
+                    </a:xfrm>
+                    <a:prstGeom prst="rect"/>
+                  </pic:spPr>
+                </pic:pic>
+              </a:graphicData>
+            </a:graphic>
+          </wp:inline>
+        </w:drawing>
+      </w:r>
+    </w:p>
+    <w:p>
+      <w:pPr>
+        <w:jc w:val="center"/>
+      </w:pPr>
+      <w:r>
+        <w:rPr>
+          <w:i/>
+          <w:color w:val="555555"/>
+          <w:sz w:val="18"/>
+        </w:rPr>
+        <w:t>Figure 2.4.4. Average CDR3 length of top 10 clones by disease category and sex.</w:t>
+      </w:r>
+    </w:p>
+    <w:p>
+      <w:pPr>
+        <w:pStyle w:val="Heading3"/>
+      </w:pPr>
+      <w:r>
+        <w:rPr>
+          <w:color w:val="1A3C6E"/>
+        </w:rPr>
+        <w:t>2.4.5 CDR3 Length (Top 10) by Disease x Age</w:t>
+      </w:r>
+    </w:p>
+    <w:p>
+      <w:pPr>
+        <w:jc w:val="center"/>
+      </w:pPr>
+      <w:r>
+        <w:drawing>
+          <wp:inline xmlns:a="http://schemas.openxmlformats.org/drawingml/2006/main" xmlns:pic="http://schemas.openxmlformats.org/drawingml/2006/picture">
+            <wp:extent cx="5029200" cy="2514600"/>
+            <wp:docPr id="29" name="Picture 29"/>
+            <wp:cNvGraphicFramePr>
+              <a:graphicFrameLocks noChangeAspect="1"/>
+            </wp:cNvGraphicFramePr>
+            <a:graphic>
+              <a:graphicData uri="http://schemas.openxmlformats.org/drawingml/2006/picture">
+                <pic:pic>
+                  <pic:nvPicPr>
+                    <pic:cNvPr id="0" name="cdr3_top10_by_disease_age.png"/>
+                    <pic:cNvPicPr/>
+                  </pic:nvPicPr>
+                  <pic:blipFill>
+                    <a:blip r:embed="rId37"/>
+                    <a:stretch>
+                      <a:fillRect/>
+                    </a:stretch>
+                  </pic:blipFill>
+                  <pic:spPr>
+                    <a:xfrm>
+                      <a:off x="0" y="0"/>
+                      <a:ext cx="5029200" cy="2514600"/>
+                    </a:xfrm>
+                    <a:prstGeom prst="rect"/>
+                  </pic:spPr>
+                </pic:pic>
+              </a:graphicData>
+            </a:graphic>
+          </wp:inline>
+        </w:drawing>
+      </w:r>
+    </w:p>
+    <w:p>
+      <w:pPr>
+        <w:jc w:val="center"/>
+      </w:pPr>
+      <w:r>
+        <w:rPr>
+          <w:i/>
+          <w:color w:val="555555"/>
+          <w:sz w:val="18"/>
+        </w:rPr>
+        <w:t>Figure 2.4.5. Average CDR3 length of top 10 clones by disease category and age group.</w:t>
+      </w:r>
+    </w:p>
+    <w:p>
+      <w:pPr>
+        <w:pStyle w:val="Heading3"/>
+      </w:pPr>
+      <w:r>
+        <w:rPr>
+          <w:color w:val="1A3C6E"/>
+        </w:rPr>
+        <w:t>2.4.6 CDR3 Length Across Clone Tiers</w:t>
+      </w:r>
+    </w:p>
+    <w:p>
+      <w:pPr>
+        <w:spacing w:after="120"/>
+      </w:pPr>
+      <w:r>
+        <w:t>This figure compares CDR3 lengths across the three clone tiers (Top 10, 100, 1000) simultaneously, showing how the most dominant clones differ from the broader repertoire.</w:t>
+      </w:r>
+    </w:p>
+    <w:p>
+      <w:pPr>
+        <w:jc w:val="center"/>
+      </w:pPr>
+      <w:r>
+        <w:drawing>
+          <wp:inline xmlns:a="http://schemas.openxmlformats.org/drawingml/2006/main" xmlns:pic="http://schemas.openxmlformats.org/drawingml/2006/picture">
+            <wp:extent cx="5029200" cy="2514600"/>
+            <wp:docPr id="30" name="Picture 30"/>
+            <wp:cNvGraphicFramePr>
+              <a:graphicFrameLocks noChangeAspect="1"/>
+            </wp:cNvGraphicFramePr>
+            <a:graphic>
+              <a:graphicData uri="http://schemas.openxmlformats.org/drawingml/2006/picture">
+                <pic:pic>
+                  <pic:nvPicPr>
+                    <pic:cNvPr id="0" name="cdr3_tiers_by_disease.png"/>
+                    <pic:cNvPicPr/>
+                  </pic:nvPicPr>
+                  <pic:blipFill>
+                    <a:blip r:embed="rId38"/>
+                    <a:stretch>
+                      <a:fillRect/>
+                    </a:stretch>
+                  </pic:blipFill>
+                  <pic:spPr>
+                    <a:xfrm>
+                      <a:off x="0" y="0"/>
+                      <a:ext cx="5029200" cy="2514600"/>
+                    </a:xfrm>
+                    <a:prstGeom prst="rect"/>
+                  </pic:spPr>
+                </pic:pic>
+              </a:graphicData>
+            </a:graphic>
+          </wp:inline>
+        </w:drawing>
+      </w:r>
+    </w:p>
+    <w:p>
+      <w:pPr>
+        <w:jc w:val="center"/>
+      </w:pPr>
+      <w:r>
+        <w:rPr>
+          <w:i/>
+          <w:color w:val="555555"/>
+          <w:sz w:val="18"/>
+        </w:rPr>
+        <w:t>Figure 2.4.6. CDR3 length across clone tiers by disease category.</w:t>
+      </w:r>
+    </w:p>
+    <w:p>
+      <w:r>
+        <w:br w:type="page"/>
+      </w:r>
+    </w:p>
+    <w:p>
+      <w:pPr>
         <w:pStyle w:val="Heading1"/>
       </w:pPr>
       <w:r>
@@ -3872,10 +4735,10 @@
         <w:rPr>
           <w:b/>
         </w:rPr>
-        <w:t xml:space="preserve">5. Sex differences: </w:t>
+        <w:t xml:space="preserve">5. CDR3 length: </w:t>
       </w:r>
       <w:r>
-        <w:t>Minimal differences in clone count or size between males and females across all disease categories.</w:t>
+        <w:t>Severe cases have the longest CDR3 in their top 10 clones (median 17.6 AA), while COVID Naive show the shortest (15.0 AA). CDR3 lengths converge across groups at the Top 1000 level (~17 AA), indicating differences are driven by the most dominant expanded clones.</w:t>
       </w:r>
     </w:p>
     <w:p>
@@ -3886,7 +4749,21 @@
         <w:rPr>
           <w:b/>
         </w:rPr>
-        <w:t xml:space="preserve">6. Age effects: </w:t>
+        <w:t xml:space="preserve">6. Sex differences: </w:t>
+      </w:r>
+      <w:r>
+        <w:t>Minimal differences in clone count, size, or CDR3 length between males and females across all disease categories.</w:t>
+      </w:r>
+    </w:p>
+    <w:p>
+      <w:pPr>
+        <w:spacing w:after="160"/>
+      </w:pPr>
+      <w:r>
+        <w:rPr>
+          <w:b/>
+        </w:rPr>
+        <w:t xml:space="preserve">7. Age effects: </w:t>
       </w:r>
       <w:r>
         <w:t>No strong age-dependent trends in clonal metrics were observed, though the age x disease confound (older patients in Severe group) limits interpretation.</w:t>
@@ -3900,7 +4777,7 @@
         <w:rPr>
           <w:b/>
         </w:rPr>
-        <w:t xml:space="preserve">7. Caveats: </w:t>
+        <w:t xml:space="preserve">8. Caveats: </w:t>
       </w:r>
       <w:r>
         <w:t>Disease category confounds with study of origin. Differences in sequencing depth, library preparation, and sample timing across studies may contribute to observed variation. These results should be interpreted as exploratory.</w:t>
@@ -3919,7 +4796,7 @@
         </w:rPr>
         <w:t>Generated from iReceptor AIRR Data Commons API data.</w:t>
         <w:br/>
-        <w:t>Analysis scripts: metadata_visualization.R, clonal_analysis.R</w:t>
+        <w:t>Analysis scripts: metadata_visualization.R, clonal_analysis.R, cdr3_analysis.R</w:t>
       </w:r>
     </w:p>
     <w:sectPr>

</xml_diff>